<commit_message>
Discovered an edge case in both algorithms
</commit_message>
<xml_diff>
--- a/ai_report/Thread_B_Report_Reviewed.docx
+++ b/ai_report/Thread_B_Report_Reviewed.docx
@@ -132,7 +132,15 @@
         <w:spacing w:before="40" w:after="40"/>
       </w:pPr>
       <w:r>
-        <w:t>Precompute all-pairs shortest paths using Floyd-Warshall.</w:t>
+        <w:t>Precompute all-pairs shortest paths using Floyd-</w:t>
+      </w:r>
+      <w:proofErr w:type="spellStart"/>
+      <w:r>
+        <w:t>Warshall</w:t>
+      </w:r>
+      <w:proofErr w:type="spellEnd"/>
+      <w:r>
+        <w:t>.</w:t>
       </w:r>
     </w:p>
     <w:p>
@@ -145,7 +153,15 @@
         <w:spacing w:before="40" w:after="40"/>
       </w:pPr>
       <w:r>
-        <w:t>Compute total item demand across all orders. Flag any item where demand exceeds current shelf stock.</w:t>
+        <w:t xml:space="preserve">Compute </w:t>
+      </w:r>
+      <w:proofErr w:type="gramStart"/>
+      <w:r>
+        <w:t>total item</w:t>
+      </w:r>
+      <w:proofErr w:type="gramEnd"/>
+      <w:r>
+        <w:t xml:space="preserve"> demand across all orders. Flag any item where demand exceeds current shelf stock.</w:t>
       </w:r>
     </w:p>
     <w:p>
@@ -158,7 +174,23 @@
         <w:spacing w:before="40" w:after="40"/>
       </w:pPr>
       <w:r>
-        <w:t>For each flagged item, create a restock request using (prep_time + delivery_time). Schedule all requests at time 0.</w:t>
+        <w:t>For each flagged item, create a restock request using (</w:t>
+      </w:r>
+      <w:proofErr w:type="spellStart"/>
+      <w:r>
+        <w:t>prep_time</w:t>
+      </w:r>
+      <w:proofErr w:type="spellEnd"/>
+      <w:r>
+        <w:t xml:space="preserve"> + </w:t>
+      </w:r>
+      <w:proofErr w:type="spellStart"/>
+      <w:r>
+        <w:t>delivery_time</w:t>
+      </w:r>
+      <w:proofErr w:type="spellEnd"/>
+      <w:r>
+        <w:t>). Schedule all requests at time 0.</w:t>
       </w:r>
     </w:p>
     <w:p>
@@ -190,7 +222,15 @@
         <w:spacing w:before="40" w:after="40"/>
       </w:pPr>
       <w:r>
-        <w:t>Route each batch using nearest-neighbour TSP from dispatch.</w:t>
+        <w:t>Route each batch using nearest-</w:t>
+      </w:r>
+      <w:proofErr w:type="spellStart"/>
+      <w:r>
+        <w:t>neighbour</w:t>
+      </w:r>
+      <w:proofErr w:type="spellEnd"/>
+      <w:r>
+        <w:t xml:space="preserve"> TSP from dispatch.</w:t>
       </w:r>
     </w:p>
     <w:p>
@@ -281,7 +321,15 @@
         <w:spacing w:before="40" w:after="40"/>
       </w:pPr>
       <w:r>
-        <w:t>No per-delivery weight capacity for restock (max_weight constraint ignored). We</w:t>
+        <w:t>No per-delivery weight capacity for restock (</w:t>
+      </w:r>
+      <w:proofErr w:type="spellStart"/>
+      <w:r>
+        <w:t>max_weight</w:t>
+      </w:r>
+      <w:proofErr w:type="spellEnd"/>
+      <w:r>
+        <w:t xml:space="preserve"> constraint ignored). We</w:t>
       </w:r>
       <w:r>
         <w:t xml:space="preserve"> prompted AI to</w:t>
@@ -306,7 +354,31 @@
         <w:t xml:space="preserve">After trying to work with AI to re-iterate on this, it </w:t>
       </w:r>
       <w:r>
-        <w:t xml:space="preserve">worked out the constraint (pick_time − restock_arrival ≤ max_wait) and </w:t>
+        <w:t>worked out the constraint (</w:t>
+      </w:r>
+      <w:proofErr w:type="spellStart"/>
+      <w:r>
+        <w:t>pick_time</w:t>
+      </w:r>
+      <w:proofErr w:type="spellEnd"/>
+      <w:r>
+        <w:t xml:space="preserve"> − </w:t>
+      </w:r>
+      <w:proofErr w:type="spellStart"/>
+      <w:r>
+        <w:t>restock_arrival</w:t>
+      </w:r>
+      <w:proofErr w:type="spellEnd"/>
+      <w:r>
+        <w:t xml:space="preserve"> ≤ </w:t>
+      </w:r>
+      <w:proofErr w:type="spellStart"/>
+      <w:r>
+        <w:t>max_wait</w:t>
+      </w:r>
+      <w:proofErr w:type="spellEnd"/>
+      <w:r>
+        <w:t xml:space="preserve">) and </w:t>
       </w:r>
       <w:r>
         <w:t>added to implementation.</w:t>
@@ -336,7 +408,15 @@
         <w:spacing w:before="80" w:after="80"/>
       </w:pPr>
       <w:r>
-        <w:t>These gaps were noted by humans that used AI again for re-iterating over the approach for refinements to reach the final implementation.</w:t>
+        <w:t xml:space="preserve">These gaps were noted by humans that used AI again for re-iterating over the approach for </w:t>
+      </w:r>
+      <w:proofErr w:type="gramStart"/>
+      <w:r>
+        <w:t>refinements</w:t>
+      </w:r>
+      <w:proofErr w:type="gramEnd"/>
+      <w:r>
+        <w:t xml:space="preserve"> to reach the final implementation.</w:t>
       </w:r>
     </w:p>
     <w:p>
@@ -642,7 +722,27 @@
                 <w:szCs w:val="18"/>
               </w:rPr>
               <w:lastRenderedPageBreak/>
-              <w:t>Floyd-Warshall here, and what is its complexity?"</w:t>
+              <w:t>Floyd-</w:t>
+            </w:r>
+            <w:proofErr w:type="spellStart"/>
+            <w:r>
+              <w:rPr>
+                <w:b w:val="0"/>
+                <w:bCs w:val="0"/>
+                <w:sz w:val="18"/>
+                <w:szCs w:val="18"/>
+              </w:rPr>
+              <w:t>Warshall</w:t>
+            </w:r>
+            <w:proofErr w:type="spellEnd"/>
+            <w:r>
+              <w:rPr>
+                <w:b w:val="0"/>
+                <w:bCs w:val="0"/>
+                <w:sz w:val="18"/>
+                <w:szCs w:val="18"/>
+              </w:rPr>
+              <w:t xml:space="preserve"> here, and what is its complexity?"</w:t>
             </w:r>
           </w:p>
         </w:tc>
@@ -677,7 +777,23 @@
                 <w:sz w:val="18"/>
                 <w:szCs w:val="18"/>
               </w:rPr>
-              <w:t>Specific graph definition given; asks for both method and complexity. AI explained Floyd-Warshall correctly with O(V³) analysis. Students verified derivation independently.</w:t>
+              <w:t>Specific graph definition given; asks for both method and complexity. AI explained Floyd-</w:t>
+            </w:r>
+            <w:proofErr w:type="spellStart"/>
+            <w:r>
+              <w:rPr>
+                <w:sz w:val="18"/>
+                <w:szCs w:val="18"/>
+              </w:rPr>
+              <w:t>Warshall</w:t>
+            </w:r>
+            <w:proofErr w:type="spellEnd"/>
+            <w:r>
+              <w:rPr>
+                <w:sz w:val="18"/>
+                <w:szCs w:val="18"/>
+              </w:rPr>
+              <w:t xml:space="preserve"> correctly with O(V³) analysis. Students verified derivation independently.</w:t>
             </w:r>
           </w:p>
         </w:tc>
@@ -872,7 +988,39 @@
                 <w:sz w:val="18"/>
                 <w:szCs w:val="18"/>
               </w:rPr>
-              <w:t>Zero context given — we handed AI the task without explaining what the problem actually required. The stub it returned ignored max_weight per delivery, delay buffers, and multi-delivery splitting. B2 found all three gaps during testing. This was the trigger for Prompt 5 (Human edit: Phase 2).</w:t>
+              <w:t xml:space="preserve">Zero context given — we handed AI the task without explaining what the problem </w:t>
+            </w:r>
+            <w:proofErr w:type="gramStart"/>
+            <w:r>
+              <w:rPr>
+                <w:sz w:val="18"/>
+                <w:szCs w:val="18"/>
+              </w:rPr>
+              <w:t>actually required</w:t>
+            </w:r>
+            <w:proofErr w:type="gramEnd"/>
+            <w:r>
+              <w:rPr>
+                <w:sz w:val="18"/>
+                <w:szCs w:val="18"/>
+              </w:rPr>
+              <w:t xml:space="preserve">. The stub it returned ignored </w:t>
+            </w:r>
+            <w:proofErr w:type="spellStart"/>
+            <w:r>
+              <w:rPr>
+                <w:sz w:val="18"/>
+                <w:szCs w:val="18"/>
+              </w:rPr>
+              <w:t>max_weight</w:t>
+            </w:r>
+            <w:proofErr w:type="spellEnd"/>
+            <w:r>
+              <w:rPr>
+                <w:sz w:val="18"/>
+                <w:szCs w:val="18"/>
+              </w:rPr>
+              <w:t xml:space="preserve"> per delivery, delay buffers, and multi-delivery splitting. B2 found all three gaps during testing. This was the trigger for Prompt 5 (Human edit: Phase 2).</w:t>
             </w:r>
           </w:p>
         </w:tc>
@@ -929,7 +1077,27 @@
                 <w:sz w:val="18"/>
                 <w:szCs w:val="18"/>
               </w:rPr>
-              <w:t>5 — Multi-delivery split (Good) “Restock of item X needs 42 units but max_weight per delivery is 40 kg and each unit weighs 2 kg. How do I split this into multiple deliveries, stagger their creation times, and ensure all arrive before the first dependent pick?”</w:t>
+              <w:t xml:space="preserve">5 — Multi-delivery split (Good) “Restock of item X needs 42 units but </w:t>
+            </w:r>
+            <w:proofErr w:type="spellStart"/>
+            <w:r>
+              <w:rPr>
+                <w:b w:val="0"/>
+                <w:bCs w:val="0"/>
+                <w:sz w:val="18"/>
+                <w:szCs w:val="18"/>
+              </w:rPr>
+              <w:t>max_weight</w:t>
+            </w:r>
+            <w:proofErr w:type="spellEnd"/>
+            <w:r>
+              <w:rPr>
+                <w:b w:val="0"/>
+                <w:bCs w:val="0"/>
+                <w:sz w:val="18"/>
+                <w:szCs w:val="18"/>
+              </w:rPr>
+              <w:t xml:space="preserve"> per delivery is 40 kg and each unit weighs 2 kg. How do I split this into multiple deliveries, stagger their creation times, and ensure all arrive before the first dependent pick?”</w:t>
             </w:r>
           </w:p>
         </w:tc>
@@ -1163,14 +1331,32 @@
                 <w:sz w:val="18"/>
                 <w:szCs w:val="18"/>
               </w:rPr>
-              <w:t xml:space="preserve">7 — Perishable check (Weak) “How do I handle perishable items?” The AI returned generic expiry-tracking advice — nothing specific enough to implement. We went back to the problem definition, </w:t>
-            </w:r>
-            <w:r>
-              <w:rPr>
-                <w:sz w:val="18"/>
-                <w:szCs w:val="18"/>
-              </w:rPr>
-              <w:t>and conversed with AI on a series of questions to reach an approach to implement to satisfy that constraint.</w:t>
+              <w:t xml:space="preserve">7 — Perishable check (Weak) “How do I handle perishable items?” The AI returned generic expiry-tracking advice — nothing specific enough to implement. We went back to the problem </w:t>
+            </w:r>
+            <w:proofErr w:type="gramStart"/>
+            <w:r>
+              <w:rPr>
+                <w:b w:val="0"/>
+                <w:bCs w:val="0"/>
+                <w:sz w:val="18"/>
+                <w:szCs w:val="18"/>
+              </w:rPr>
+              <w:t xml:space="preserve">definition, </w:t>
+            </w:r>
+            <w:r>
+              <w:rPr>
+                <w:sz w:val="18"/>
+                <w:szCs w:val="18"/>
+              </w:rPr>
+              <w:t>and</w:t>
+            </w:r>
+            <w:proofErr w:type="gramEnd"/>
+            <w:r>
+              <w:rPr>
+                <w:sz w:val="18"/>
+                <w:szCs w:val="18"/>
+              </w:rPr>
+              <w:t xml:space="preserve"> conversed with AI on a series of questions to reach an approach to implement to satisfy that constraint.</w:t>
             </w:r>
           </w:p>
         </w:tc>
@@ -1436,7 +1622,23 @@
                 <w:sz w:val="18"/>
                 <w:szCs w:val="18"/>
               </w:rPr>
-              <w:t xml:space="preserve">Three distinct failure modes specified. AI gave structured </w:t>
+              <w:t xml:space="preserve">Three distinct failure modes </w:t>
+            </w:r>
+            <w:proofErr w:type="gramStart"/>
+            <w:r>
+              <w:rPr>
+                <w:sz w:val="18"/>
+                <w:szCs w:val="18"/>
+              </w:rPr>
+              <w:t>specified</w:t>
+            </w:r>
+            <w:proofErr w:type="gramEnd"/>
+            <w:r>
+              <w:rPr>
+                <w:sz w:val="18"/>
+                <w:szCs w:val="18"/>
+              </w:rPr>
+              <w:t xml:space="preserve">. AI gave structured </w:t>
             </w:r>
             <w:r>
               <w:rPr>
@@ -1515,7 +1717,47 @@
                 <w:sz w:val="18"/>
                 <w:szCs w:val="18"/>
               </w:rPr>
-              <w:t xml:space="preserve"> — Debugging Case 2 (Good) "Case 2 returns INFEASIBLE with a stock violation for item IX at time 23.7, but restock is scheduled to arrive at 45 min. The batch packer runs at time 0 for all pickers. Here is the Phase 4 loop [code]. Why does IX get picked before restock arrives?"</w:t>
+              <w:t xml:space="preserve"> — Debugging Case 2 (Good) "Case 2 returns INFEASIBLE with a stock violation for item IX at time 23.7, but restock is scheduled to arrive at 45 min. The batch packer runs </w:t>
+            </w:r>
+            <w:proofErr w:type="gramStart"/>
+            <w:r>
+              <w:rPr>
+                <w:b w:val="0"/>
+                <w:bCs w:val="0"/>
+                <w:sz w:val="18"/>
+                <w:szCs w:val="18"/>
+              </w:rPr>
+              <w:t>at time</w:t>
+            </w:r>
+            <w:proofErr w:type="gramEnd"/>
+            <w:r>
+              <w:rPr>
+                <w:b w:val="0"/>
+                <w:bCs w:val="0"/>
+                <w:sz w:val="18"/>
+                <w:szCs w:val="18"/>
+              </w:rPr>
+              <w:t xml:space="preserve"> 0 for all pickers. Here is the Phase 4 loop [code]. Why does IX get picked before </w:t>
+            </w:r>
+            <w:proofErr w:type="gramStart"/>
+            <w:r>
+              <w:rPr>
+                <w:b w:val="0"/>
+                <w:bCs w:val="0"/>
+                <w:sz w:val="18"/>
+                <w:szCs w:val="18"/>
+              </w:rPr>
+              <w:t>restock</w:t>
+            </w:r>
+            <w:proofErr w:type="gramEnd"/>
+            <w:r>
+              <w:rPr>
+                <w:b w:val="0"/>
+                <w:bCs w:val="0"/>
+                <w:sz w:val="18"/>
+                <w:szCs w:val="18"/>
+              </w:rPr>
+              <w:t xml:space="preserve"> arrives?"</w:t>
             </w:r>
           </w:p>
         </w:tc>
@@ -1657,7 +1899,15 @@
         <w:t xml:space="preserve">but </w:t>
       </w:r>
       <w:r>
-        <w:t>every single one of them was wrong in a subtle way. The three bugs it introduced took longer to find and fix than it would have taken to write that function ourselves.</w:t>
+        <w:t xml:space="preserve">every single one of them was wrong in a subtle way. The three bugs it introduced took longer to find and fix than it would have taken to write that function </w:t>
+      </w:r>
+      <w:proofErr w:type="gramStart"/>
+      <w:r>
+        <w:t>ourselves</w:t>
+      </w:r>
+      <w:proofErr w:type="gramEnd"/>
+      <w:r>
+        <w:t>.</w:t>
       </w:r>
     </w:p>
     <w:p>
@@ -1872,8 +2122,13 @@
               <w:t>32</w:t>
             </w:r>
             <w:r>
-              <w:t xml:space="preserve"> ms</w:t>
-            </w:r>
+              <w:t xml:space="preserve"> </w:t>
+            </w:r>
+            <w:proofErr w:type="spellStart"/>
+            <w:r>
+              <w:t>ms</w:t>
+            </w:r>
+            <w:proofErr w:type="spellEnd"/>
           </w:p>
         </w:tc>
         <w:tc>
@@ -1931,8 +2186,13 @@
               <w:t>10.17</w:t>
             </w:r>
             <w:r>
-              <w:t xml:space="preserve"> ms</w:t>
-            </w:r>
+              <w:t xml:space="preserve"> </w:t>
+            </w:r>
+            <w:proofErr w:type="spellStart"/>
+            <w:r>
+              <w:t>ms</w:t>
+            </w:r>
+            <w:proofErr w:type="spellEnd"/>
           </w:p>
         </w:tc>
         <w:tc>
@@ -1996,8 +2256,13 @@
               <w:t>4.19</w:t>
             </w:r>
             <w:r>
-              <w:t xml:space="preserve"> ms</w:t>
-            </w:r>
+              <w:t xml:space="preserve"> </w:t>
+            </w:r>
+            <w:proofErr w:type="spellStart"/>
+            <w:r>
+              <w:t>ms</w:t>
+            </w:r>
+            <w:proofErr w:type="spellEnd"/>
           </w:p>
         </w:tc>
         <w:tc>
@@ -2017,12 +2282,10 @@
       <w:tr>
         <w:tc>
           <w:tcPr>
+            <w:cnfStyle w:val="001000000000" w:firstRow="0" w:lastRow="0" w:firstColumn="1" w:lastColumn="0" w:oddVBand="0" w:evenVBand="0" w:oddHBand="0" w:evenHBand="0" w:firstRowFirstColumn="0" w:firstRowLastColumn="0" w:lastRowFirstColumn="0" w:lastRowLastColumn="0"/>
             <w:tcW w:w="5399" w:type="dxa"/>
           </w:tcPr>
           <w:p>
-            <w:pPr>
-              <w:cnfStyle w:val="001000000000" w:firstRow="0" w:lastRow="0" w:firstColumn="1" w:lastColumn="0" w:oddVBand="0" w:evenVBand="0" w:oddHBand="0" w:evenHBand="0" w:firstRowFirstColumn="0" w:firstRowLastColumn="0" w:lastRowFirstColumn="0" w:lastRowLastColumn="0"/>
-            </w:pPr>
             <w:r>
               <w:rPr>
                 <w:b w:val="0"/>
@@ -2037,6 +2300,9 @@
             <w:tcW w:w="1620" w:type="dxa"/>
           </w:tcPr>
           <w:p>
+            <w:pPr>
+              <w:cnfStyle w:val="000000000000" w:firstRow="0" w:lastRow="0" w:firstColumn="0" w:lastColumn="0" w:oddVBand="0" w:evenVBand="0" w:oddHBand="0" w:evenHBand="0" w:firstRowFirstColumn="0" w:firstRowLastColumn="0" w:lastRowFirstColumn="0" w:lastRowLastColumn="0"/>
+            </w:pPr>
             <w:r>
               <w:t>INFEASIBLE</w:t>
             </w:r>
@@ -2047,6 +2313,9 @@
             <w:tcW w:w="1440" w:type="dxa"/>
           </w:tcPr>
           <w:p>
+            <w:pPr>
+              <w:cnfStyle w:val="000000000000" w:firstRow="0" w:lastRow="0" w:firstColumn="0" w:lastColumn="0" w:oddVBand="0" w:evenVBand="0" w:oddHBand="0" w:evenHBand="0" w:firstRowFirstColumn="0" w:firstRowLastColumn="0" w:lastRowFirstColumn="0" w:lastRowLastColumn="0"/>
+            </w:pPr>
             <w:r>
               <w:t>4.</w:t>
             </w:r>
@@ -2054,8 +2323,13 @@
               <w:t>98</w:t>
             </w:r>
             <w:r>
-              <w:t xml:space="preserve"> ms</w:t>
-            </w:r>
+              <w:t xml:space="preserve"> </w:t>
+            </w:r>
+            <w:proofErr w:type="spellStart"/>
+            <w:r>
+              <w:t>ms</w:t>
+            </w:r>
+            <w:proofErr w:type="spellEnd"/>
           </w:p>
         </w:tc>
         <w:tc>
@@ -2063,6 +2337,9 @@
             <w:tcW w:w="1620" w:type="dxa"/>
           </w:tcPr>
           <w:p>
+            <w:pPr>
+              <w:cnfStyle w:val="000000000000" w:firstRow="0" w:lastRow="0" w:firstColumn="0" w:lastColumn="0" w:oddVBand="0" w:evenVBand="0" w:oddHBand="0" w:evenHBand="0" w:firstRowFirstColumn="0" w:firstRowLastColumn="0" w:lastRowFirstColumn="0" w:lastRowLastColumn="0"/>
+            </w:pPr>
             <w:r>
               <w:t>INFEASIBLE</w:t>
             </w:r>
@@ -2135,7 +2412,15 @@
       </w:pPr>
       <w:r>
         <w:lastRenderedPageBreak/>
-        <w:t>Restock reserve exactly equal to shortfall: FEASIBLE. Restock splits into minimum required deliveries.</w:t>
+        <w:t xml:space="preserve">Restock </w:t>
+      </w:r>
+      <w:proofErr w:type="gramStart"/>
+      <w:r>
+        <w:t>reserve</w:t>
+      </w:r>
+      <w:proofErr w:type="gramEnd"/>
+      <w:r>
+        <w:t xml:space="preserve"> exactly equal to shortfall: FEASIBLE. Restock splits into minimum required deliveries.</w:t>
       </w:r>
     </w:p>
     <w:p>
@@ -2161,7 +2446,36 @@
         <w:spacing w:before="40" w:after="40"/>
       </w:pPr>
       <w:r>
-        <w:t>Overtime trigger: manually set a shift_end of 10 min with 30 orders. Algorithm exceeded overtime limit and returned INFEASIBLE. Verified correct.</w:t>
+        <w:t xml:space="preserve">Overtime trigger: manually set a </w:t>
+      </w:r>
+      <w:proofErr w:type="spellStart"/>
+      <w:r>
+        <w:t>shift_end</w:t>
+      </w:r>
+      <w:proofErr w:type="spellEnd"/>
+      <w:r>
+        <w:t xml:space="preserve"> of 10 min with 30 orders. Algorithm exceeded overtime limit and returned INFEASIBLE. Verified correct.</w:t>
+      </w:r>
+    </w:p>
+    <w:p>
+      <w:pPr>
+        <w:spacing w:before="40" w:after="40"/>
+      </w:pPr>
+      <w:r>
+        <w:t>Moreover, an edge case that is not handled was discovered just before the deadline:</w:t>
+      </w:r>
+    </w:p>
+    <w:p>
+      <w:pPr>
+        <w:pStyle w:val="ListParagraph"/>
+        <w:numPr>
+          <w:ilvl w:val="0"/>
+          <w:numId w:val="4"/>
+        </w:numPr>
+        <w:spacing w:before="40" w:after="40"/>
+      </w:pPr>
+      <w:r>
+        <w:t>All remaining orders need item IX, stock is 0, restock arrives later.</w:t>
       </w:r>
     </w:p>
     <w:p>
@@ -2262,7 +2576,23 @@
                 <w:b w:val="0"/>
                 <w:bCs w:val="0"/>
               </w:rPr>
-              <w:t>Floyd-Warshall (graph setup)</w:t>
+              <w:t>Floyd-</w:t>
+            </w:r>
+            <w:proofErr w:type="spellStart"/>
+            <w:r>
+              <w:rPr>
+                <w:b w:val="0"/>
+                <w:bCs w:val="0"/>
+              </w:rPr>
+              <w:t>Warshall</w:t>
+            </w:r>
+            <w:proofErr w:type="spellEnd"/>
+            <w:r>
+              <w:rPr>
+                <w:b w:val="0"/>
+                <w:bCs w:val="0"/>
+              </w:rPr>
+              <w:t xml:space="preserve"> (graph setup)</w:t>
             </w:r>
           </w:p>
         </w:tc>
@@ -2304,8 +2634,13 @@
             <w:pPr>
               <w:cnfStyle w:val="000000000000" w:firstRow="0" w:lastRow="0" w:firstColumn="0" w:lastColumn="0" w:oddVBand="0" w:evenVBand="0" w:oddHBand="0" w:evenHBand="0" w:firstRowFirstColumn="0" w:firstRowLastColumn="0" w:lastRowFirstColumn="0" w:lastRowLastColumn="0"/>
             </w:pPr>
-            <w:r>
-              <w:t>O(M log M)</w:t>
+            <w:proofErr w:type="gramStart"/>
+            <w:r>
+              <w:t>O(</w:t>
+            </w:r>
+            <w:proofErr w:type="gramEnd"/>
+            <w:r>
+              <w:t>M log M)</w:t>
             </w:r>
           </w:p>
         </w:tc>
@@ -2430,8 +2765,13 @@
             <w:pPr>
               <w:cnfStyle w:val="000000000000" w:firstRow="0" w:lastRow="0" w:firstColumn="0" w:lastColumn="0" w:oddVBand="0" w:evenVBand="0" w:oddHBand="0" w:evenHBand="0" w:firstRowFirstColumn="0" w:firstRowLastColumn="0" w:lastRowFirstColumn="0" w:lastRowLastColumn="0"/>
             </w:pPr>
-            <w:r>
-              <w:t>O(V³ + M·P + B·S²)</w:t>
+            <w:proofErr w:type="gramStart"/>
+            <w:r>
+              <w:t>O(</w:t>
+            </w:r>
+            <w:proofErr w:type="gramEnd"/>
+            <w:r>
+              <w:t>V³ + M·P + B·S²)</w:t>
             </w:r>
           </w:p>
         </w:tc>
@@ -2480,7 +2820,15 @@
         <w:spacing w:before="40" w:after="40"/>
       </w:pPr>
       <w:r>
-        <w:t>Floyd-Warshall: O(V³)</w:t>
+        <w:t>Floyd-</w:t>
+      </w:r>
+      <w:proofErr w:type="spellStart"/>
+      <w:r>
+        <w:t>Warshall</w:t>
+      </w:r>
+      <w:proofErr w:type="spellEnd"/>
+      <w:r>
+        <w:t>: O(V³)</w:t>
       </w:r>
     </w:p>
     <w:p>
@@ -2493,7 +2841,15 @@
         <w:spacing w:before="40" w:after="40"/>
       </w:pPr>
       <w:r>
-        <w:t>Order sort: O(M log M)</w:t>
+        <w:t xml:space="preserve">Order sort: </w:t>
+      </w:r>
+      <w:proofErr w:type="gramStart"/>
+      <w:r>
+        <w:t>O(</w:t>
+      </w:r>
+      <w:proofErr w:type="gramEnd"/>
+      <w:r>
+        <w:t>M log M)</w:t>
       </w:r>
     </w:p>
     <w:p>
@@ -2506,7 +2862,23 @@
         <w:spacing w:before="40" w:after="40"/>
       </w:pPr>
       <w:r>
-        <w:t>Batch packing: O(rounds · M · P) ≈ O(M · P) in practice (rounds ≤ M/P)</w:t>
+        <w:t xml:space="preserve">Batch packing: </w:t>
+      </w:r>
+      <w:proofErr w:type="gramStart"/>
+      <w:r>
+        <w:t>O(</w:t>
+      </w:r>
+      <w:proofErr w:type="gramEnd"/>
+      <w:r>
+        <w:t xml:space="preserve">rounds · M · P) ≈ </w:t>
+      </w:r>
+      <w:proofErr w:type="gramStart"/>
+      <w:r>
+        <w:t>O(</w:t>
+      </w:r>
+      <w:proofErr w:type="gramEnd"/>
+      <w:r>
+        <w:t>M · P) in practice (rounds ≤ M/P)</w:t>
       </w:r>
     </w:p>
     <w:p>
@@ -2519,7 +2891,15 @@
         <w:spacing w:before="40" w:after="40"/>
       </w:pPr>
       <w:r>
-        <w:t>TSP routing: O(B · S²)</w:t>
+        <w:t xml:space="preserve">TSP routing: </w:t>
+      </w:r>
+      <w:proofErr w:type="gramStart"/>
+      <w:r>
+        <w:t>O(</w:t>
+      </w:r>
+      <w:proofErr w:type="gramEnd"/>
+      <w:r>
+        <w:t>B · S²)</w:t>
       </w:r>
     </w:p>
     <w:p>
@@ -2532,7 +2912,15 @@
         <w:spacing w:before="40" w:after="40"/>
       </w:pPr>
       <w:r>
-        <w:t>Validation: O(B · S + M)</w:t>
+        <w:t xml:space="preserve">Validation: </w:t>
+      </w:r>
+      <w:proofErr w:type="gramStart"/>
+      <w:r>
+        <w:t>O(</w:t>
+      </w:r>
+      <w:proofErr w:type="gramEnd"/>
+      <w:r>
+        <w:t>B · S + M)</w:t>
       </w:r>
     </w:p>
     <w:p>
@@ -2545,7 +2933,15 @@
         <w:spacing w:before="40" w:after="40"/>
       </w:pPr>
       <w:r>
-        <w:t>Total: O(V³ + M log M + M·P + B·S²)</w:t>
+        <w:t xml:space="preserve">Total: </w:t>
+      </w:r>
+      <w:proofErr w:type="gramStart"/>
+      <w:r>
+        <w:t>O(</w:t>
+      </w:r>
+      <w:proofErr w:type="gramEnd"/>
+      <w:r>
+        <w:t>V³ + M log M + M·P + B·S²)</w:t>
       </w:r>
     </w:p>
     <w:p>
@@ -2981,6 +3377,7 @@
         <w:jc w:val="both"/>
       </w:pPr>
       <w:r>
+        <w:lastRenderedPageBreak/>
         <w:t>Looking back, AI genuinely helped with the structural boilerplate</w:t>
       </w:r>
       <w:r>
@@ -2993,11 +3390,7 @@
         <w:t xml:space="preserve"> while it was </w:t>
       </w:r>
       <w:r>
-        <w:t xml:space="preserve">throwing away output that was too vague to use. The three “Human edit:” labels in the source file are the most concrete record of that cost: </w:t>
-      </w:r>
-      <w:r>
-        <w:lastRenderedPageBreak/>
-        <w:t xml:space="preserve">those are the places where we stopped waiting for AI to get it right and just </w:t>
+        <w:t xml:space="preserve">throwing away output that was too vague to use. The three “Human edit:” labels in the source file are the most concrete record of that cost: those are the places where we stopped waiting for AI to get it right and just </w:t>
       </w:r>
       <w:r>
         <w:t xml:space="preserve">handed it </w:t>
@@ -3082,7 +3475,43 @@
           <w:sz w:val="18"/>
           <w:szCs w:val="18"/>
         </w:rPr>
-        <w:t>WAREHOUSE-PLANNER(G, items, orders, pickers, restock_info):</w:t>
+        <w:t>WAREHOUSE-</w:t>
+      </w:r>
+      <w:proofErr w:type="gramStart"/>
+      <w:r>
+        <w:rPr>
+          <w:rFonts w:ascii="Courier New" w:eastAsia="Courier New" w:hAnsi="Courier New" w:cs="Courier New"/>
+          <w:sz w:val="18"/>
+          <w:szCs w:val="18"/>
+        </w:rPr>
+        <w:t>PLANNER(</w:t>
+      </w:r>
+      <w:proofErr w:type="gramEnd"/>
+      <w:r>
+        <w:rPr>
+          <w:rFonts w:ascii="Courier New" w:eastAsia="Courier New" w:hAnsi="Courier New" w:cs="Courier New"/>
+          <w:sz w:val="18"/>
+          <w:szCs w:val="18"/>
+        </w:rPr>
+        <w:t xml:space="preserve">G, items, orders, pickers, </w:t>
+      </w:r>
+      <w:proofErr w:type="spellStart"/>
+      <w:r>
+        <w:rPr>
+          <w:rFonts w:ascii="Courier New" w:eastAsia="Courier New" w:hAnsi="Courier New" w:cs="Courier New"/>
+          <w:sz w:val="18"/>
+          <w:szCs w:val="18"/>
+        </w:rPr>
+        <w:t>restock_info</w:t>
+      </w:r>
+      <w:proofErr w:type="spellEnd"/>
+      <w:r>
+        <w:rPr>
+          <w:rFonts w:ascii="Courier New" w:eastAsia="Courier New" w:hAnsi="Courier New" w:cs="Courier New"/>
+          <w:sz w:val="18"/>
+          <w:szCs w:val="18"/>
+        </w:rPr>
+        <w:t>):</w:t>
       </w:r>
     </w:p>
     <w:p>
@@ -3110,7 +3539,25 @@
           <w:sz w:val="18"/>
           <w:szCs w:val="18"/>
         </w:rPr>
-        <w:t xml:space="preserve">  Floyd-Warshall(G)</w:t>
+        <w:t xml:space="preserve">  Floyd-</w:t>
+      </w:r>
+      <w:proofErr w:type="spellStart"/>
+      <w:r>
+        <w:rPr>
+          <w:rFonts w:ascii="Courier New" w:eastAsia="Courier New" w:hAnsi="Courier New" w:cs="Courier New"/>
+          <w:sz w:val="18"/>
+          <w:szCs w:val="18"/>
+        </w:rPr>
+        <w:t>Warshall</w:t>
+      </w:r>
+      <w:proofErr w:type="spellEnd"/>
+      <w:r>
+        <w:rPr>
+          <w:rFonts w:ascii="Courier New" w:eastAsia="Courier New" w:hAnsi="Courier New" w:cs="Courier New"/>
+          <w:sz w:val="18"/>
+          <w:szCs w:val="18"/>
+        </w:rPr>
+        <w:t>(G)</w:t>
       </w:r>
     </w:p>
     <w:p>
@@ -3152,7 +3599,79 @@
           <w:sz w:val="18"/>
           <w:szCs w:val="18"/>
         </w:rPr>
-        <w:t xml:space="preserve">  for each item i: shortfall[i] ← max(0, demand[i] − stock[i])</w:t>
+        <w:t xml:space="preserve">  for each item i: shortfall[</w:t>
+      </w:r>
+      <w:proofErr w:type="spellStart"/>
+      <w:r>
+        <w:rPr>
+          <w:rFonts w:ascii="Courier New" w:eastAsia="Courier New" w:hAnsi="Courier New" w:cs="Courier New"/>
+          <w:sz w:val="18"/>
+          <w:szCs w:val="18"/>
+        </w:rPr>
+        <w:t>i</w:t>
+      </w:r>
+      <w:proofErr w:type="spellEnd"/>
+      <w:r>
+        <w:rPr>
+          <w:rFonts w:ascii="Courier New" w:eastAsia="Courier New" w:hAnsi="Courier New" w:cs="Courier New"/>
+          <w:sz w:val="18"/>
+          <w:szCs w:val="18"/>
+        </w:rPr>
+        <w:t xml:space="preserve">] ← </w:t>
+      </w:r>
+      <w:proofErr w:type="gramStart"/>
+      <w:r>
+        <w:rPr>
+          <w:rFonts w:ascii="Courier New" w:eastAsia="Courier New" w:hAnsi="Courier New" w:cs="Courier New"/>
+          <w:sz w:val="18"/>
+          <w:szCs w:val="18"/>
+        </w:rPr>
+        <w:t>max(</w:t>
+      </w:r>
+      <w:proofErr w:type="gramEnd"/>
+      <w:r>
+        <w:rPr>
+          <w:rFonts w:ascii="Courier New" w:eastAsia="Courier New" w:hAnsi="Courier New" w:cs="Courier New"/>
+          <w:sz w:val="18"/>
+          <w:szCs w:val="18"/>
+        </w:rPr>
+        <w:t>0, demand[</w:t>
+      </w:r>
+      <w:proofErr w:type="spellStart"/>
+      <w:r>
+        <w:rPr>
+          <w:rFonts w:ascii="Courier New" w:eastAsia="Courier New" w:hAnsi="Courier New" w:cs="Courier New"/>
+          <w:sz w:val="18"/>
+          <w:szCs w:val="18"/>
+        </w:rPr>
+        <w:t>i</w:t>
+      </w:r>
+      <w:proofErr w:type="spellEnd"/>
+      <w:r>
+        <w:rPr>
+          <w:rFonts w:ascii="Courier New" w:eastAsia="Courier New" w:hAnsi="Courier New" w:cs="Courier New"/>
+          <w:sz w:val="18"/>
+          <w:szCs w:val="18"/>
+        </w:rPr>
+        <w:t>] − stock[</w:t>
+      </w:r>
+      <w:proofErr w:type="spellStart"/>
+      <w:r>
+        <w:rPr>
+          <w:rFonts w:ascii="Courier New" w:eastAsia="Courier New" w:hAnsi="Courier New" w:cs="Courier New"/>
+          <w:sz w:val="18"/>
+          <w:szCs w:val="18"/>
+        </w:rPr>
+        <w:t>i</w:t>
+      </w:r>
+      <w:proofErr w:type="spellEnd"/>
+      <w:r>
+        <w:rPr>
+          <w:rFonts w:ascii="Courier New" w:eastAsia="Courier New" w:hAnsi="Courier New" w:cs="Courier New"/>
+          <w:sz w:val="18"/>
+          <w:szCs w:val="18"/>
+        </w:rPr>
+        <w:t>])</w:t>
       </w:r>
     </w:p>
     <w:p>
@@ -3180,7 +3699,43 @@
           <w:sz w:val="18"/>
           <w:szCs w:val="18"/>
         </w:rPr>
-        <w:t xml:space="preserve">  for each item i with shortfall[i] &gt; 0:</w:t>
+        <w:t xml:space="preserve">  for each item </w:t>
+      </w:r>
+      <w:proofErr w:type="spellStart"/>
+      <w:r>
+        <w:rPr>
+          <w:rFonts w:ascii="Courier New" w:eastAsia="Courier New" w:hAnsi="Courier New" w:cs="Courier New"/>
+          <w:sz w:val="18"/>
+          <w:szCs w:val="18"/>
+        </w:rPr>
+        <w:t>i</w:t>
+      </w:r>
+      <w:proofErr w:type="spellEnd"/>
+      <w:r>
+        <w:rPr>
+          <w:rFonts w:ascii="Courier New" w:eastAsia="Courier New" w:hAnsi="Courier New" w:cs="Courier New"/>
+          <w:sz w:val="18"/>
+          <w:szCs w:val="18"/>
+        </w:rPr>
+        <w:t xml:space="preserve"> with shortfall[</w:t>
+      </w:r>
+      <w:proofErr w:type="spellStart"/>
+      <w:r>
+        <w:rPr>
+          <w:rFonts w:ascii="Courier New" w:eastAsia="Courier New" w:hAnsi="Courier New" w:cs="Courier New"/>
+          <w:sz w:val="18"/>
+          <w:szCs w:val="18"/>
+        </w:rPr>
+        <w:t>i</w:t>
+      </w:r>
+      <w:proofErr w:type="spellEnd"/>
+      <w:r>
+        <w:rPr>
+          <w:rFonts w:ascii="Courier New" w:eastAsia="Courier New" w:hAnsi="Courier New" w:cs="Courier New"/>
+          <w:sz w:val="18"/>
+          <w:szCs w:val="18"/>
+        </w:rPr>
+        <w:t>] &gt; 0:</w:t>
       </w:r>
     </w:p>
     <w:p>
@@ -3194,7 +3749,43 @@
           <w:sz w:val="18"/>
           <w:szCs w:val="18"/>
         </w:rPr>
-        <w:t xml:space="preserve">    if reserve[i] &lt; shortfall[i]: return INFEASIBLE</w:t>
+        <w:t xml:space="preserve">    if reserve[</w:t>
+      </w:r>
+      <w:proofErr w:type="spellStart"/>
+      <w:r>
+        <w:rPr>
+          <w:rFonts w:ascii="Courier New" w:eastAsia="Courier New" w:hAnsi="Courier New" w:cs="Courier New"/>
+          <w:sz w:val="18"/>
+          <w:szCs w:val="18"/>
+        </w:rPr>
+        <w:t>i</w:t>
+      </w:r>
+      <w:proofErr w:type="spellEnd"/>
+      <w:r>
+        <w:rPr>
+          <w:rFonts w:ascii="Courier New" w:eastAsia="Courier New" w:hAnsi="Courier New" w:cs="Courier New"/>
+          <w:sz w:val="18"/>
+          <w:szCs w:val="18"/>
+        </w:rPr>
+        <w:t>] &lt; shortfall[</w:t>
+      </w:r>
+      <w:proofErr w:type="spellStart"/>
+      <w:r>
+        <w:rPr>
+          <w:rFonts w:ascii="Courier New" w:eastAsia="Courier New" w:hAnsi="Courier New" w:cs="Courier New"/>
+          <w:sz w:val="18"/>
+          <w:szCs w:val="18"/>
+        </w:rPr>
+        <w:t>i</w:t>
+      </w:r>
+      <w:proofErr w:type="spellEnd"/>
+      <w:r>
+        <w:rPr>
+          <w:rFonts w:ascii="Courier New" w:eastAsia="Courier New" w:hAnsi="Courier New" w:cs="Courier New"/>
+          <w:sz w:val="18"/>
+          <w:szCs w:val="18"/>
+        </w:rPr>
+        <w:t>]: return INFEASIBLE</w:t>
       </w:r>
     </w:p>
     <w:p>
@@ -3208,7 +3799,79 @@
           <w:sz w:val="18"/>
           <w:szCs w:val="18"/>
         </w:rPr>
-        <w:t xml:space="preserve">    units_per_delivery ← floor(max_weight[i] / weight[i])</w:t>
+        <w:t xml:space="preserve">    </w:t>
+      </w:r>
+      <w:proofErr w:type="spellStart"/>
+      <w:r>
+        <w:rPr>
+          <w:rFonts w:ascii="Courier New" w:eastAsia="Courier New" w:hAnsi="Courier New" w:cs="Courier New"/>
+          <w:sz w:val="18"/>
+          <w:szCs w:val="18"/>
+        </w:rPr>
+        <w:t>units_per_delivery</w:t>
+      </w:r>
+      <w:proofErr w:type="spellEnd"/>
+      <w:r>
+        <w:rPr>
+          <w:rFonts w:ascii="Courier New" w:eastAsia="Courier New" w:hAnsi="Courier New" w:cs="Courier New"/>
+          <w:sz w:val="18"/>
+          <w:szCs w:val="18"/>
+        </w:rPr>
+        <w:t xml:space="preserve"> ← floor(</w:t>
+      </w:r>
+      <w:proofErr w:type="spellStart"/>
+      <w:r>
+        <w:rPr>
+          <w:rFonts w:ascii="Courier New" w:eastAsia="Courier New" w:hAnsi="Courier New" w:cs="Courier New"/>
+          <w:sz w:val="18"/>
+          <w:szCs w:val="18"/>
+        </w:rPr>
+        <w:t>max_weight</w:t>
+      </w:r>
+      <w:proofErr w:type="spellEnd"/>
+      <w:r>
+        <w:rPr>
+          <w:rFonts w:ascii="Courier New" w:eastAsia="Courier New" w:hAnsi="Courier New" w:cs="Courier New"/>
+          <w:sz w:val="18"/>
+          <w:szCs w:val="18"/>
+        </w:rPr>
+        <w:t>[</w:t>
+      </w:r>
+      <w:proofErr w:type="spellStart"/>
+      <w:r>
+        <w:rPr>
+          <w:rFonts w:ascii="Courier New" w:eastAsia="Courier New" w:hAnsi="Courier New" w:cs="Courier New"/>
+          <w:sz w:val="18"/>
+          <w:szCs w:val="18"/>
+        </w:rPr>
+        <w:t>i</w:t>
+      </w:r>
+      <w:proofErr w:type="spellEnd"/>
+      <w:r>
+        <w:rPr>
+          <w:rFonts w:ascii="Courier New" w:eastAsia="Courier New" w:hAnsi="Courier New" w:cs="Courier New"/>
+          <w:sz w:val="18"/>
+          <w:szCs w:val="18"/>
+        </w:rPr>
+        <w:t>] / weight[</w:t>
+      </w:r>
+      <w:proofErr w:type="spellStart"/>
+      <w:r>
+        <w:rPr>
+          <w:rFonts w:ascii="Courier New" w:eastAsia="Courier New" w:hAnsi="Courier New" w:cs="Courier New"/>
+          <w:sz w:val="18"/>
+          <w:szCs w:val="18"/>
+        </w:rPr>
+        <w:t>i</w:t>
+      </w:r>
+      <w:proofErr w:type="spellEnd"/>
+      <w:r>
+        <w:rPr>
+          <w:rFonts w:ascii="Courier New" w:eastAsia="Courier New" w:hAnsi="Courier New" w:cs="Courier New"/>
+          <w:sz w:val="18"/>
+          <w:szCs w:val="18"/>
+        </w:rPr>
+        <w:t>])</w:t>
       </w:r>
     </w:p>
     <w:p>
@@ -3222,7 +3885,43 @@
           <w:sz w:val="18"/>
           <w:szCs w:val="18"/>
         </w:rPr>
-        <w:t xml:space="preserve">    remaining ← shortfall[i]; t_create ← 0</w:t>
+        <w:t xml:space="preserve">    remaining ← shortfall[</w:t>
+      </w:r>
+      <w:proofErr w:type="spellStart"/>
+      <w:r>
+        <w:rPr>
+          <w:rFonts w:ascii="Courier New" w:eastAsia="Courier New" w:hAnsi="Courier New" w:cs="Courier New"/>
+          <w:sz w:val="18"/>
+          <w:szCs w:val="18"/>
+        </w:rPr>
+        <w:t>i</w:t>
+      </w:r>
+      <w:proofErr w:type="spellEnd"/>
+      <w:r>
+        <w:rPr>
+          <w:rFonts w:ascii="Courier New" w:eastAsia="Courier New" w:hAnsi="Courier New" w:cs="Courier New"/>
+          <w:sz w:val="18"/>
+          <w:szCs w:val="18"/>
+        </w:rPr>
+        <w:t xml:space="preserve">]; </w:t>
+      </w:r>
+      <w:proofErr w:type="spellStart"/>
+      <w:r>
+        <w:rPr>
+          <w:rFonts w:ascii="Courier New" w:eastAsia="Courier New" w:hAnsi="Courier New" w:cs="Courier New"/>
+          <w:sz w:val="18"/>
+          <w:szCs w:val="18"/>
+        </w:rPr>
+        <w:t>t_create</w:t>
+      </w:r>
+      <w:proofErr w:type="spellEnd"/>
+      <w:r>
+        <w:rPr>
+          <w:rFonts w:ascii="Courier New" w:eastAsia="Courier New" w:hAnsi="Courier New" w:cs="Courier New"/>
+          <w:sz w:val="18"/>
+          <w:szCs w:val="18"/>
+        </w:rPr>
+        <w:t xml:space="preserve"> ← 0</w:t>
       </w:r>
     </w:p>
     <w:p>
@@ -3250,7 +3949,43 @@
           <w:sz w:val="18"/>
           <w:szCs w:val="18"/>
         </w:rPr>
-        <w:t xml:space="preserve">      qty ← min(remaining, units_per_delivery)</w:t>
+        <w:t xml:space="preserve">      qty ← </w:t>
+      </w:r>
+      <w:proofErr w:type="gramStart"/>
+      <w:r>
+        <w:rPr>
+          <w:rFonts w:ascii="Courier New" w:eastAsia="Courier New" w:hAnsi="Courier New" w:cs="Courier New"/>
+          <w:sz w:val="18"/>
+          <w:szCs w:val="18"/>
+        </w:rPr>
+        <w:t>min(</w:t>
+      </w:r>
+      <w:proofErr w:type="gramEnd"/>
+      <w:r>
+        <w:rPr>
+          <w:rFonts w:ascii="Courier New" w:eastAsia="Courier New" w:hAnsi="Courier New" w:cs="Courier New"/>
+          <w:sz w:val="18"/>
+          <w:szCs w:val="18"/>
+        </w:rPr>
+        <w:t xml:space="preserve">remaining, </w:t>
+      </w:r>
+      <w:proofErr w:type="spellStart"/>
+      <w:r>
+        <w:rPr>
+          <w:rFonts w:ascii="Courier New" w:eastAsia="Courier New" w:hAnsi="Courier New" w:cs="Courier New"/>
+          <w:sz w:val="18"/>
+          <w:szCs w:val="18"/>
+        </w:rPr>
+        <w:t>units_per_delivery</w:t>
+      </w:r>
+      <w:proofErr w:type="spellEnd"/>
+      <w:r>
+        <w:rPr>
+          <w:rFonts w:ascii="Courier New" w:eastAsia="Courier New" w:hAnsi="Courier New" w:cs="Courier New"/>
+          <w:sz w:val="18"/>
+          <w:szCs w:val="18"/>
+        </w:rPr>
+        <w:t>)</w:t>
       </w:r>
     </w:p>
     <w:p>
@@ -3264,7 +3999,97 @@
           <w:sz w:val="18"/>
           <w:szCs w:val="18"/>
         </w:rPr>
-        <w:t xml:space="preserve">      buf ← delay_buffer[i] if delay_risk[i] &gt; 0.3 else 0</w:t>
+        <w:t xml:space="preserve">      </w:t>
+      </w:r>
+      <w:proofErr w:type="spellStart"/>
+      <w:r>
+        <w:rPr>
+          <w:rFonts w:ascii="Courier New" w:eastAsia="Courier New" w:hAnsi="Courier New" w:cs="Courier New"/>
+          <w:sz w:val="18"/>
+          <w:szCs w:val="18"/>
+        </w:rPr>
+        <w:t>buf</w:t>
+      </w:r>
+      <w:proofErr w:type="spellEnd"/>
+      <w:r>
+        <w:rPr>
+          <w:rFonts w:ascii="Courier New" w:eastAsia="Courier New" w:hAnsi="Courier New" w:cs="Courier New"/>
+          <w:sz w:val="18"/>
+          <w:szCs w:val="18"/>
+        </w:rPr>
+        <w:t xml:space="preserve"> ← </w:t>
+      </w:r>
+      <w:proofErr w:type="spellStart"/>
+      <w:r>
+        <w:rPr>
+          <w:rFonts w:ascii="Courier New" w:eastAsia="Courier New" w:hAnsi="Courier New" w:cs="Courier New"/>
+          <w:sz w:val="18"/>
+          <w:szCs w:val="18"/>
+        </w:rPr>
+        <w:t>delay_buffer</w:t>
+      </w:r>
+      <w:proofErr w:type="spellEnd"/>
+      <w:r>
+        <w:rPr>
+          <w:rFonts w:ascii="Courier New" w:eastAsia="Courier New" w:hAnsi="Courier New" w:cs="Courier New"/>
+          <w:sz w:val="18"/>
+          <w:szCs w:val="18"/>
+        </w:rPr>
+        <w:t>[</w:t>
+      </w:r>
+      <w:proofErr w:type="spellStart"/>
+      <w:r>
+        <w:rPr>
+          <w:rFonts w:ascii="Courier New" w:eastAsia="Courier New" w:hAnsi="Courier New" w:cs="Courier New"/>
+          <w:sz w:val="18"/>
+          <w:szCs w:val="18"/>
+        </w:rPr>
+        <w:t>i</w:t>
+      </w:r>
+      <w:proofErr w:type="spellEnd"/>
+      <w:r>
+        <w:rPr>
+          <w:rFonts w:ascii="Courier New" w:eastAsia="Courier New" w:hAnsi="Courier New" w:cs="Courier New"/>
+          <w:sz w:val="18"/>
+          <w:szCs w:val="18"/>
+        </w:rPr>
+        <w:t xml:space="preserve">] if </w:t>
+      </w:r>
+      <w:proofErr w:type="spellStart"/>
+      <w:r>
+        <w:rPr>
+          <w:rFonts w:ascii="Courier New" w:eastAsia="Courier New" w:hAnsi="Courier New" w:cs="Courier New"/>
+          <w:sz w:val="18"/>
+          <w:szCs w:val="18"/>
+        </w:rPr>
+        <w:t>delay_risk</w:t>
+      </w:r>
+      <w:proofErr w:type="spellEnd"/>
+      <w:r>
+        <w:rPr>
+          <w:rFonts w:ascii="Courier New" w:eastAsia="Courier New" w:hAnsi="Courier New" w:cs="Courier New"/>
+          <w:sz w:val="18"/>
+          <w:szCs w:val="18"/>
+        </w:rPr>
+        <w:t>[</w:t>
+      </w:r>
+      <w:proofErr w:type="spellStart"/>
+      <w:r>
+        <w:rPr>
+          <w:rFonts w:ascii="Courier New" w:eastAsia="Courier New" w:hAnsi="Courier New" w:cs="Courier New"/>
+          <w:sz w:val="18"/>
+          <w:szCs w:val="18"/>
+        </w:rPr>
+        <w:t>i</w:t>
+      </w:r>
+      <w:proofErr w:type="spellEnd"/>
+      <w:r>
+        <w:rPr>
+          <w:rFonts w:ascii="Courier New" w:eastAsia="Courier New" w:hAnsi="Courier New" w:cs="Courier New"/>
+          <w:sz w:val="18"/>
+          <w:szCs w:val="18"/>
+        </w:rPr>
+        <w:t>] &gt; 0.3 else 0</w:t>
       </w:r>
     </w:p>
     <w:p>
@@ -3278,8 +4103,72 @@
           <w:sz w:val="18"/>
           <w:szCs w:val="18"/>
         </w:rPr>
-        <w:t xml:space="preserve">      arrival ← t_create + prep[i] + delivery[i] + buf</w:t>
-      </w:r>
+        <w:t xml:space="preserve">      arrival ← </w:t>
+      </w:r>
+      <w:proofErr w:type="spellStart"/>
+      <w:r>
+        <w:rPr>
+          <w:rFonts w:ascii="Courier New" w:eastAsia="Courier New" w:hAnsi="Courier New" w:cs="Courier New"/>
+          <w:sz w:val="18"/>
+          <w:szCs w:val="18"/>
+        </w:rPr>
+        <w:t>t_create</w:t>
+      </w:r>
+      <w:proofErr w:type="spellEnd"/>
+      <w:r>
+        <w:rPr>
+          <w:rFonts w:ascii="Courier New" w:eastAsia="Courier New" w:hAnsi="Courier New" w:cs="Courier New"/>
+          <w:sz w:val="18"/>
+          <w:szCs w:val="18"/>
+        </w:rPr>
+        <w:t xml:space="preserve"> + prep[</w:t>
+      </w:r>
+      <w:proofErr w:type="spellStart"/>
+      <w:r>
+        <w:rPr>
+          <w:rFonts w:ascii="Courier New" w:eastAsia="Courier New" w:hAnsi="Courier New" w:cs="Courier New"/>
+          <w:sz w:val="18"/>
+          <w:szCs w:val="18"/>
+        </w:rPr>
+        <w:t>i</w:t>
+      </w:r>
+      <w:proofErr w:type="spellEnd"/>
+      <w:r>
+        <w:rPr>
+          <w:rFonts w:ascii="Courier New" w:eastAsia="Courier New" w:hAnsi="Courier New" w:cs="Courier New"/>
+          <w:sz w:val="18"/>
+          <w:szCs w:val="18"/>
+        </w:rPr>
+        <w:t>] + delivery[</w:t>
+      </w:r>
+      <w:proofErr w:type="spellStart"/>
+      <w:r>
+        <w:rPr>
+          <w:rFonts w:ascii="Courier New" w:eastAsia="Courier New" w:hAnsi="Courier New" w:cs="Courier New"/>
+          <w:sz w:val="18"/>
+          <w:szCs w:val="18"/>
+        </w:rPr>
+        <w:t>i</w:t>
+      </w:r>
+      <w:proofErr w:type="spellEnd"/>
+      <w:r>
+        <w:rPr>
+          <w:rFonts w:ascii="Courier New" w:eastAsia="Courier New" w:hAnsi="Courier New" w:cs="Courier New"/>
+          <w:sz w:val="18"/>
+          <w:szCs w:val="18"/>
+        </w:rPr>
+        <w:t xml:space="preserve">] + </w:t>
+      </w:r>
+      <w:proofErr w:type="spellStart"/>
+      <w:r>
+        <w:rPr>
+          <w:rFonts w:ascii="Courier New" w:eastAsia="Courier New" w:hAnsi="Courier New" w:cs="Courier New"/>
+          <w:sz w:val="18"/>
+          <w:szCs w:val="18"/>
+        </w:rPr>
+        <w:t>buf</w:t>
+      </w:r>
+      <w:proofErr w:type="spellEnd"/>
     </w:p>
     <w:p>
       <w:pPr>
@@ -3292,7 +4181,63 @@
           <w:sz w:val="18"/>
           <w:szCs w:val="18"/>
         </w:rPr>
-        <w:t xml:space="preserve">      add RestockRequest(i, qty, arrival); remaining -= qty; t_create += 1</w:t>
+        <w:t xml:space="preserve">      add </w:t>
+      </w:r>
+      <w:proofErr w:type="spellStart"/>
+      <w:proofErr w:type="gramStart"/>
+      <w:r>
+        <w:rPr>
+          <w:rFonts w:ascii="Courier New" w:eastAsia="Courier New" w:hAnsi="Courier New" w:cs="Courier New"/>
+          <w:sz w:val="18"/>
+          <w:szCs w:val="18"/>
+        </w:rPr>
+        <w:t>RestockRequest</w:t>
+      </w:r>
+      <w:proofErr w:type="spellEnd"/>
+      <w:r>
+        <w:rPr>
+          <w:rFonts w:ascii="Courier New" w:eastAsia="Courier New" w:hAnsi="Courier New" w:cs="Courier New"/>
+          <w:sz w:val="18"/>
+          <w:szCs w:val="18"/>
+        </w:rPr>
+        <w:t>(</w:t>
+      </w:r>
+      <w:proofErr w:type="spellStart"/>
+      <w:proofErr w:type="gramEnd"/>
+      <w:r>
+        <w:rPr>
+          <w:rFonts w:ascii="Courier New" w:eastAsia="Courier New" w:hAnsi="Courier New" w:cs="Courier New"/>
+          <w:sz w:val="18"/>
+          <w:szCs w:val="18"/>
+        </w:rPr>
+        <w:t>i</w:t>
+      </w:r>
+      <w:proofErr w:type="spellEnd"/>
+      <w:r>
+        <w:rPr>
+          <w:rFonts w:ascii="Courier New" w:eastAsia="Courier New" w:hAnsi="Courier New" w:cs="Courier New"/>
+          <w:sz w:val="18"/>
+          <w:szCs w:val="18"/>
+        </w:rPr>
+        <w:t xml:space="preserve">, qty, arrival); remaining -= qty; </w:t>
+      </w:r>
+      <w:proofErr w:type="spellStart"/>
+      <w:r>
+        <w:rPr>
+          <w:rFonts w:ascii="Courier New" w:eastAsia="Courier New" w:hAnsi="Courier New" w:cs="Courier New"/>
+          <w:sz w:val="18"/>
+          <w:szCs w:val="18"/>
+        </w:rPr>
+        <w:t>t_create</w:t>
+      </w:r>
+      <w:proofErr w:type="spellEnd"/>
+      <w:r>
+        <w:rPr>
+          <w:rFonts w:ascii="Courier New" w:eastAsia="Courier New" w:hAnsi="Courier New" w:cs="Courier New"/>
+          <w:sz w:val="18"/>
+          <w:szCs w:val="18"/>
+        </w:rPr>
+        <w:t xml:space="preserve"> += 1</w:t>
       </w:r>
     </w:p>
     <w:p>
@@ -3362,7 +4307,25 @@
           <w:sz w:val="18"/>
           <w:szCs w:val="18"/>
         </w:rPr>
-        <w:t xml:space="preserve">    for each picker pk (sorted by shift_start):</w:t>
+        <w:t xml:space="preserve">    for each picker pk (sorted by </w:t>
+      </w:r>
+      <w:proofErr w:type="spellStart"/>
+      <w:r>
+        <w:rPr>
+          <w:rFonts w:ascii="Courier New" w:eastAsia="Courier New" w:hAnsi="Courier New" w:cs="Courier New"/>
+          <w:sz w:val="18"/>
+          <w:szCs w:val="18"/>
+        </w:rPr>
+        <w:t>shift_start</w:t>
+      </w:r>
+      <w:proofErr w:type="spellEnd"/>
+      <w:r>
+        <w:rPr>
+          <w:rFonts w:ascii="Courier New" w:eastAsia="Courier New" w:hAnsi="Courier New" w:cs="Courier New"/>
+          <w:sz w:val="18"/>
+          <w:szCs w:val="18"/>
+        </w:rPr>
+        <w:t>):</w:t>
       </w:r>
     </w:p>
     <w:p>
@@ -3376,7 +4339,25 @@
           <w:sz w:val="18"/>
           <w:szCs w:val="18"/>
         </w:rPr>
-        <w:t xml:space="preserve">      batch ← empty; t ← picker_free[pk]</w:t>
+        <w:t xml:space="preserve">      batch ← empty; t ← </w:t>
+      </w:r>
+      <w:proofErr w:type="spellStart"/>
+      <w:r>
+        <w:rPr>
+          <w:rFonts w:ascii="Courier New" w:eastAsia="Courier New" w:hAnsi="Courier New" w:cs="Courier New"/>
+          <w:sz w:val="18"/>
+          <w:szCs w:val="18"/>
+        </w:rPr>
+        <w:t>picker_free</w:t>
+      </w:r>
+      <w:proofErr w:type="spellEnd"/>
+      <w:r>
+        <w:rPr>
+          <w:rFonts w:ascii="Courier New" w:eastAsia="Courier New" w:hAnsi="Courier New" w:cs="Courier New"/>
+          <w:sz w:val="18"/>
+          <w:szCs w:val="18"/>
+        </w:rPr>
+        <w:t>[pk]</w:t>
       </w:r>
     </w:p>
     <w:p>
@@ -3404,7 +4385,27 @@
           <w:sz w:val="18"/>
           <w:szCs w:val="18"/>
         </w:rPr>
-        <w:t xml:space="preserve">        if o.release &gt; t: skip</w:t>
+        <w:t xml:space="preserve">        if </w:t>
+      </w:r>
+      <w:proofErr w:type="spellStart"/>
+      <w:proofErr w:type="gramStart"/>
+      <w:r>
+        <w:rPr>
+          <w:rFonts w:ascii="Courier New" w:eastAsia="Courier New" w:hAnsi="Courier New" w:cs="Courier New"/>
+          <w:sz w:val="18"/>
+          <w:szCs w:val="18"/>
+        </w:rPr>
+        <w:t>o.release</w:t>
+      </w:r>
+      <w:proofErr w:type="spellEnd"/>
+      <w:proofErr w:type="gramEnd"/>
+      <w:r>
+        <w:rPr>
+          <w:rFonts w:ascii="Courier New" w:eastAsia="Courier New" w:hAnsi="Courier New" w:cs="Courier New"/>
+          <w:sz w:val="18"/>
+          <w:szCs w:val="18"/>
+        </w:rPr>
+        <w:t xml:space="preserve"> &gt; t: skip</w:t>
       </w:r>
     </w:p>
     <w:p>
@@ -3418,7 +4419,63 @@
           <w:sz w:val="18"/>
           <w:szCs w:val="18"/>
         </w:rPr>
-        <w:t xml:space="preserve">        if batch_weight + order_weight(o) &gt; pk.capacity: skip</w:t>
+        <w:t xml:space="preserve">        if </w:t>
+      </w:r>
+      <w:proofErr w:type="spellStart"/>
+      <w:r>
+        <w:rPr>
+          <w:rFonts w:ascii="Courier New" w:eastAsia="Courier New" w:hAnsi="Courier New" w:cs="Courier New"/>
+          <w:sz w:val="18"/>
+          <w:szCs w:val="18"/>
+        </w:rPr>
+        <w:t>batch_weight</w:t>
+      </w:r>
+      <w:proofErr w:type="spellEnd"/>
+      <w:r>
+        <w:rPr>
+          <w:rFonts w:ascii="Courier New" w:eastAsia="Courier New" w:hAnsi="Courier New" w:cs="Courier New"/>
+          <w:sz w:val="18"/>
+          <w:szCs w:val="18"/>
+        </w:rPr>
+        <w:t xml:space="preserve"> + </w:t>
+      </w:r>
+      <w:proofErr w:type="spellStart"/>
+      <w:r>
+        <w:rPr>
+          <w:rFonts w:ascii="Courier New" w:eastAsia="Courier New" w:hAnsi="Courier New" w:cs="Courier New"/>
+          <w:sz w:val="18"/>
+          <w:szCs w:val="18"/>
+        </w:rPr>
+        <w:t>order_weight</w:t>
+      </w:r>
+      <w:proofErr w:type="spellEnd"/>
+      <w:r>
+        <w:rPr>
+          <w:rFonts w:ascii="Courier New" w:eastAsia="Courier New" w:hAnsi="Courier New" w:cs="Courier New"/>
+          <w:sz w:val="18"/>
+          <w:szCs w:val="18"/>
+        </w:rPr>
+        <w:t xml:space="preserve">(o) &gt; </w:t>
+      </w:r>
+      <w:proofErr w:type="spellStart"/>
+      <w:proofErr w:type="gramStart"/>
+      <w:r>
+        <w:rPr>
+          <w:rFonts w:ascii="Courier New" w:eastAsia="Courier New" w:hAnsi="Courier New" w:cs="Courier New"/>
+          <w:sz w:val="18"/>
+          <w:szCs w:val="18"/>
+        </w:rPr>
+        <w:t>pk.capacity</w:t>
+      </w:r>
+      <w:proofErr w:type="spellEnd"/>
+      <w:proofErr w:type="gramEnd"/>
+      <w:r>
+        <w:rPr>
+          <w:rFonts w:ascii="Courier New" w:eastAsia="Courier New" w:hAnsi="Courier New" w:cs="Courier New"/>
+          <w:sz w:val="18"/>
+          <w:szCs w:val="18"/>
+        </w:rPr>
+        <w:t>: skip</w:t>
       </w:r>
     </w:p>
     <w:p>
@@ -3460,8 +4517,18 @@
           <w:sz w:val="18"/>
           <w:szCs w:val="18"/>
         </w:rPr>
-        <w:t xml:space="preserve">      if batch non-empty: route(batch); record dispatch_time</w:t>
-      </w:r>
+        <w:t xml:space="preserve">      if batch non-empty: route(batch); record </w:t>
+      </w:r>
+      <w:proofErr w:type="spellStart"/>
+      <w:r>
+        <w:rPr>
+          <w:rFonts w:ascii="Courier New" w:eastAsia="Courier New" w:hAnsi="Courier New" w:cs="Courier New"/>
+          <w:sz w:val="18"/>
+          <w:szCs w:val="18"/>
+        </w:rPr>
+        <w:t>dispatch_time</w:t>
+      </w:r>
+      <w:proofErr w:type="spellEnd"/>
     </w:p>
     <w:p>
       <w:pPr>
@@ -3474,7 +4541,25 @@
           <w:sz w:val="18"/>
           <w:szCs w:val="18"/>
         </w:rPr>
-        <w:t xml:space="preserve">  // Phase 5 — nearest-neighbour TSP per batch</w:t>
+        <w:t xml:space="preserve">  // Phase 5 — nearest-</w:t>
+      </w:r>
+      <w:proofErr w:type="spellStart"/>
+      <w:r>
+        <w:rPr>
+          <w:rFonts w:ascii="Courier New" w:eastAsia="Courier New" w:hAnsi="Courier New" w:cs="Courier New"/>
+          <w:sz w:val="18"/>
+          <w:szCs w:val="18"/>
+        </w:rPr>
+        <w:t>neighbour</w:t>
+      </w:r>
+      <w:proofErr w:type="spellEnd"/>
+      <w:r>
+        <w:rPr>
+          <w:rFonts w:ascii="Courier New" w:eastAsia="Courier New" w:hAnsi="Courier New" w:cs="Courier New"/>
+          <w:sz w:val="18"/>
+          <w:szCs w:val="18"/>
+        </w:rPr>
+        <w:t xml:space="preserve"> TSP per batch</w:t>
       </w:r>
     </w:p>
     <w:p>
@@ -3502,7 +4587,43 @@
           <w:sz w:val="18"/>
           <w:szCs w:val="18"/>
         </w:rPr>
-        <w:t xml:space="preserve">    seq ← NN-TSP(D, shelves_in_batch)</w:t>
+        <w:t xml:space="preserve">    seq ← NN-</w:t>
+      </w:r>
+      <w:proofErr w:type="gramStart"/>
+      <w:r>
+        <w:rPr>
+          <w:rFonts w:ascii="Courier New" w:eastAsia="Courier New" w:hAnsi="Courier New" w:cs="Courier New"/>
+          <w:sz w:val="18"/>
+          <w:szCs w:val="18"/>
+        </w:rPr>
+        <w:t>TSP(</w:t>
+      </w:r>
+      <w:proofErr w:type="gramEnd"/>
+      <w:r>
+        <w:rPr>
+          <w:rFonts w:ascii="Courier New" w:eastAsia="Courier New" w:hAnsi="Courier New" w:cs="Courier New"/>
+          <w:sz w:val="18"/>
+          <w:szCs w:val="18"/>
+        </w:rPr>
+        <w:t xml:space="preserve">D, </w:t>
+      </w:r>
+      <w:proofErr w:type="spellStart"/>
+      <w:r>
+        <w:rPr>
+          <w:rFonts w:ascii="Courier New" w:eastAsia="Courier New" w:hAnsi="Courier New" w:cs="Courier New"/>
+          <w:sz w:val="18"/>
+          <w:szCs w:val="18"/>
+        </w:rPr>
+        <w:t>shelves_in_batch</w:t>
+      </w:r>
+      <w:proofErr w:type="spellEnd"/>
+      <w:r>
+        <w:rPr>
+          <w:rFonts w:ascii="Courier New" w:eastAsia="Courier New" w:hAnsi="Courier New" w:cs="Courier New"/>
+          <w:sz w:val="18"/>
+          <w:szCs w:val="18"/>
+        </w:rPr>
+        <w:t>)</w:t>
       </w:r>
     </w:p>
     <w:p>
@@ -3516,8 +4637,18 @@
           <w:sz w:val="18"/>
           <w:szCs w:val="18"/>
         </w:rPr>
-        <w:t xml:space="preserve">    simulate travel + service time along seq; compute dispatch_time</w:t>
-      </w:r>
+        <w:t xml:space="preserve">    simulate travel + service time along seq; compute </w:t>
+      </w:r>
+      <w:proofErr w:type="spellStart"/>
+      <w:r>
+        <w:rPr>
+          <w:rFonts w:ascii="Courier New" w:eastAsia="Courier New" w:hAnsi="Courier New" w:cs="Courier New"/>
+          <w:sz w:val="18"/>
+          <w:szCs w:val="18"/>
+        </w:rPr>
+        <w:t>dispatch_time</w:t>
+      </w:r>
+      <w:proofErr w:type="spellEnd"/>
     </w:p>
     <w:p>
       <w:pPr>
@@ -3544,7 +4675,25 @@
           <w:sz w:val="18"/>
           <w:szCs w:val="18"/>
         </w:rPr>
-        <w:t xml:space="preserve">  for each batch (sorted by start_time):</w:t>
+        <w:t xml:space="preserve">  for each batch (sorted by </w:t>
+      </w:r>
+      <w:proofErr w:type="spellStart"/>
+      <w:r>
+        <w:rPr>
+          <w:rFonts w:ascii="Courier New" w:eastAsia="Courier New" w:hAnsi="Courier New" w:cs="Courier New"/>
+          <w:sz w:val="18"/>
+          <w:szCs w:val="18"/>
+        </w:rPr>
+        <w:t>start_time</w:t>
+      </w:r>
+      <w:proofErr w:type="spellEnd"/>
+      <w:r>
+        <w:rPr>
+          <w:rFonts w:ascii="Courier New" w:eastAsia="Courier New" w:hAnsi="Courier New" w:cs="Courier New"/>
+          <w:sz w:val="18"/>
+          <w:szCs w:val="18"/>
+        </w:rPr>
+        <w:t>):</w:t>
       </w:r>
     </w:p>
     <w:p>
@@ -3558,8 +4707,28 @@
           <w:sz w:val="18"/>
           <w:szCs w:val="18"/>
         </w:rPr>
-        <w:t xml:space="preserve">    apply restocks arriving ≤ batch.start_time</w:t>
-      </w:r>
+        <w:t xml:space="preserve">    apply restocks arriving ≤ </w:t>
+      </w:r>
+      <w:proofErr w:type="spellStart"/>
+      <w:proofErr w:type="gramStart"/>
+      <w:r>
+        <w:rPr>
+          <w:rFonts w:ascii="Courier New" w:eastAsia="Courier New" w:hAnsi="Courier New" w:cs="Courier New"/>
+          <w:sz w:val="18"/>
+          <w:szCs w:val="18"/>
+        </w:rPr>
+        <w:t>batch.start</w:t>
+      </w:r>
+      <w:proofErr w:type="gramEnd"/>
+      <w:r>
+        <w:rPr>
+          <w:rFonts w:ascii="Courier New" w:eastAsia="Courier New" w:hAnsi="Courier New" w:cs="Courier New"/>
+          <w:sz w:val="18"/>
+          <w:szCs w:val="18"/>
+        </w:rPr>
+        <w:t>_time</w:t>
+      </w:r>
+      <w:proofErr w:type="spellEnd"/>
     </w:p>
     <w:p>
       <w:pPr>
@@ -3572,8 +4741,18 @@
           <w:sz w:val="18"/>
           <w:szCs w:val="18"/>
         </w:rPr>
-        <w:t xml:space="preserve">    for each shelf in route: apply restocks arriving ≤ pick_time</w:t>
-      </w:r>
+        <w:t xml:space="preserve">    for each shelf in route: apply restocks arriving ≤ </w:t>
+      </w:r>
+      <w:proofErr w:type="spellStart"/>
+      <w:r>
+        <w:rPr>
+          <w:rFonts w:ascii="Courier New" w:eastAsia="Courier New" w:hAnsi="Courier New" w:cs="Courier New"/>
+          <w:sz w:val="18"/>
+          <w:szCs w:val="18"/>
+        </w:rPr>
+        <w:t>pick_time</w:t>
+      </w:r>
+      <w:proofErr w:type="spellEnd"/>
     </w:p>
     <w:p>
       <w:pPr>
@@ -3600,8 +4779,54 @@
           <w:sz w:val="18"/>
           <w:szCs w:val="18"/>
         </w:rPr>
-        <w:t xml:space="preserve">      if perishable: check pick_time − restock_arrival ≤ max_wait</w:t>
-      </w:r>
+        <w:t xml:space="preserve">      if perishable: check </w:t>
+      </w:r>
+      <w:proofErr w:type="spellStart"/>
+      <w:r>
+        <w:rPr>
+          <w:rFonts w:ascii="Courier New" w:eastAsia="Courier New" w:hAnsi="Courier New" w:cs="Courier New"/>
+          <w:sz w:val="18"/>
+          <w:szCs w:val="18"/>
+        </w:rPr>
+        <w:t>pick_time</w:t>
+      </w:r>
+      <w:proofErr w:type="spellEnd"/>
+      <w:r>
+        <w:rPr>
+          <w:rFonts w:ascii="Courier New" w:eastAsia="Courier New" w:hAnsi="Courier New" w:cs="Courier New"/>
+          <w:sz w:val="18"/>
+          <w:szCs w:val="18"/>
+        </w:rPr>
+        <w:t xml:space="preserve"> − </w:t>
+      </w:r>
+      <w:proofErr w:type="spellStart"/>
+      <w:r>
+        <w:rPr>
+          <w:rFonts w:ascii="Courier New" w:eastAsia="Courier New" w:hAnsi="Courier New" w:cs="Courier New"/>
+          <w:sz w:val="18"/>
+          <w:szCs w:val="18"/>
+        </w:rPr>
+        <w:t>restock_arrival</w:t>
+      </w:r>
+      <w:proofErr w:type="spellEnd"/>
+      <w:r>
+        <w:rPr>
+          <w:rFonts w:ascii="Courier New" w:eastAsia="Courier New" w:hAnsi="Courier New" w:cs="Courier New"/>
+          <w:sz w:val="18"/>
+          <w:szCs w:val="18"/>
+        </w:rPr>
+        <w:t xml:space="preserve"> ≤ </w:t>
+      </w:r>
+      <w:proofErr w:type="spellStart"/>
+      <w:r>
+        <w:rPr>
+          <w:rFonts w:ascii="Courier New" w:eastAsia="Courier New" w:hAnsi="Courier New" w:cs="Courier New"/>
+          <w:sz w:val="18"/>
+          <w:szCs w:val="18"/>
+        </w:rPr>
+        <w:t>max_wait</w:t>
+      </w:r>
+      <w:proofErr w:type="spellEnd"/>
     </w:p>
     <w:p>
       <w:pPr>
@@ -3614,7 +4839,25 @@
           <w:sz w:val="18"/>
           <w:szCs w:val="18"/>
         </w:rPr>
-        <w:t xml:space="preserve">    if dispatch_time &gt; deadline: return INFEASIBLE</w:t>
+        <w:t xml:space="preserve">    if </w:t>
+      </w:r>
+      <w:proofErr w:type="spellStart"/>
+      <w:r>
+        <w:rPr>
+          <w:rFonts w:ascii="Courier New" w:eastAsia="Courier New" w:hAnsi="Courier New" w:cs="Courier New"/>
+          <w:sz w:val="18"/>
+          <w:szCs w:val="18"/>
+        </w:rPr>
+        <w:t>dispatch_time</w:t>
+      </w:r>
+      <w:proofErr w:type="spellEnd"/>
+      <w:r>
+        <w:rPr>
+          <w:rFonts w:ascii="Courier New" w:eastAsia="Courier New" w:hAnsi="Courier New" w:cs="Courier New"/>
+          <w:sz w:val="18"/>
+          <w:szCs w:val="18"/>
+        </w:rPr>
+        <w:t xml:space="preserve"> &gt; deadline: return INFEASIBLE</w:t>
       </w:r>
     </w:p>
     <w:p>
@@ -3628,7 +4871,43 @@
           <w:sz w:val="18"/>
           <w:szCs w:val="18"/>
         </w:rPr>
-        <w:t xml:space="preserve">  for each picker: if finish &gt; shift_end + overtime_limit: return INFEASIBLE</w:t>
+        <w:t xml:space="preserve">  for each picker: if finish &gt; </w:t>
+      </w:r>
+      <w:proofErr w:type="spellStart"/>
+      <w:r>
+        <w:rPr>
+          <w:rFonts w:ascii="Courier New" w:eastAsia="Courier New" w:hAnsi="Courier New" w:cs="Courier New"/>
+          <w:sz w:val="18"/>
+          <w:szCs w:val="18"/>
+        </w:rPr>
+        <w:t>shift_end</w:t>
+      </w:r>
+      <w:proofErr w:type="spellEnd"/>
+      <w:r>
+        <w:rPr>
+          <w:rFonts w:ascii="Courier New" w:eastAsia="Courier New" w:hAnsi="Courier New" w:cs="Courier New"/>
+          <w:sz w:val="18"/>
+          <w:szCs w:val="18"/>
+        </w:rPr>
+        <w:t xml:space="preserve"> + </w:t>
+      </w:r>
+      <w:proofErr w:type="spellStart"/>
+      <w:r>
+        <w:rPr>
+          <w:rFonts w:ascii="Courier New" w:eastAsia="Courier New" w:hAnsi="Courier New" w:cs="Courier New"/>
+          <w:sz w:val="18"/>
+          <w:szCs w:val="18"/>
+        </w:rPr>
+        <w:t>overtime_limit</w:t>
+      </w:r>
+      <w:proofErr w:type="spellEnd"/>
+      <w:r>
+        <w:rPr>
+          <w:rFonts w:ascii="Courier New" w:eastAsia="Courier New" w:hAnsi="Courier New" w:cs="Courier New"/>
+          <w:sz w:val="18"/>
+          <w:szCs w:val="18"/>
+        </w:rPr>
+        <w:t>: return INFEASIBLE</w:t>
       </w:r>
     </w:p>
     <w:p>
@@ -3642,8 +4921,18 @@
           <w:sz w:val="18"/>
           <w:szCs w:val="18"/>
         </w:rPr>
-        <w:t xml:space="preserve">  return plan</w:t>
-      </w:r>
+        <w:t xml:space="preserve">  </w:t>
+      </w:r>
+      <w:proofErr w:type="gramStart"/>
+      <w:r>
+        <w:rPr>
+          <w:rFonts w:ascii="Courier New" w:eastAsia="Courier New" w:hAnsi="Courier New" w:cs="Courier New"/>
+          <w:sz w:val="18"/>
+          <w:szCs w:val="18"/>
+        </w:rPr>
+        <w:t>return plan</w:t>
+      </w:r>
+      <w:proofErr w:type="gramEnd"/>
     </w:p>
     <w:sectPr>
       <w:pgSz w:w="12240" w:h="15840"/>
@@ -3658,6 +4947,118 @@
 <file path=word/numbering.xml><?xml version="1.0" encoding="utf-8"?>
 <w:numbering xmlns:wpc="http://schemas.microsoft.com/office/word/2010/wordprocessingCanvas" xmlns:cx="http://schemas.microsoft.com/office/drawing/2014/chartex" xmlns:cx1="http://schemas.microsoft.com/office/drawing/2015/9/8/chartex" xmlns:cx2="http://schemas.microsoft.com/office/drawing/2015/10/21/chartex" xmlns:cx3="http://schemas.microsoft.com/office/drawing/2016/5/9/chartex" xmlns:cx4="http://schemas.microsoft.com/office/drawing/2016/5/10/chartex" xmlns:cx5="http://schemas.microsoft.com/office/drawing/2016/5/11/chartex" xmlns:cx6="http://schemas.microsoft.com/office/drawing/2016/5/12/chartex" xmlns:cx7="http://schemas.microsoft.com/office/drawing/2016/5/13/chartex" xmlns:cx8="http://schemas.microsoft.com/office/drawing/2016/5/14/chartex" xmlns:mc="http://schemas.openxmlformats.org/markup-compatibility/2006" xmlns:aink="http://schemas.microsoft.com/office/drawing/2016/ink" xmlns:am3d="http://schemas.microsoft.com/office/drawing/2017/model3d" xmlns:o="urn:schemas-microsoft-com:office:office" xmlns:oel="http://schemas.microsoft.com/office/2019/extlst" xmlns:r="http://schemas.openxmlformats.org/officeDocument/2006/relationships" xmlns:m="http://schemas.openxmlformats.org/officeDocument/2006/math" xmlns:v="urn:schemas-microsoft-com:vml" xmlns:wp14="http://schemas.microsoft.com/office/word/2010/wordprocessingDrawing" xmlns:wp="http://schemas.openxmlformats.org/drawingml/2006/wordprocessingDrawing" xmlns:w10="urn:schemas-microsoft-com:office:word" xmlns:w="http://schemas.openxmlformats.org/wordprocessingml/2006/main" xmlns:w14="http://schemas.microsoft.com/office/word/2010/wordml" xmlns:w15="http://schemas.microsoft.com/office/word/2012/wordml" xmlns:w16cex="http://schemas.microsoft.com/office/word/2018/wordml/cex" xmlns:w16cid="http://schemas.microsoft.com/office/word/2016/wordml/cid" xmlns:w16="http://schemas.microsoft.com/office/word/2018/wordml" xmlns:w16du="http://schemas.microsoft.com/office/word/2023/wordml/word16du" xmlns:w16sdtdh="http://schemas.microsoft.com/office/word/2020/wordml/sdtdatahash" xmlns:w16sdtfl="http://schemas.microsoft.com/office/word/2024/wordml/sdtformatlock" xmlns:w16se="http://schemas.microsoft.com/office/word/2015/wordml/symex" xmlns:wpg="http://schemas.microsoft.com/office/word/2010/wordprocessingGroup" xmlns:wpi="http://schemas.microsoft.com/office/word/2010/wordprocessingInk" xmlns:wne="http://schemas.microsoft.com/office/word/2006/wordml" xmlns:wps="http://schemas.microsoft.com/office/word/2010/wordprocessingShape" mc:Ignorable="w14 w15 w16se w16cid w16 w16cex w16sdtdh w16sdtfl w16du wp14">
   <w:abstractNum w:abstractNumId="0" w15:restartNumberingAfterBreak="0">
+    <w:nsid w:val="3B0202F7"/>
+    <w:multiLevelType w:val="hybridMultilevel"/>
+    <w:tmpl w:val="28A6DEF8"/>
+    <w:lvl w:ilvl="0" w:tplc="3CFE2D02">
+      <w:numFmt w:val="bullet"/>
+      <w:lvlText w:val="-"/>
+      <w:lvlJc w:val="left"/>
+      <w:pPr>
+        <w:ind w:left="720" w:hanging="360"/>
+      </w:pPr>
+      <w:rPr>
+        <w:rFonts w:ascii="Arial" w:eastAsia="Arial" w:hAnsi="Arial" w:cs="Arial" w:hint="default"/>
+      </w:rPr>
+    </w:lvl>
+    <w:lvl w:ilvl="1" w:tplc="04090003" w:tentative="1">
+      <w:start w:val="1"/>
+      <w:numFmt w:val="bullet"/>
+      <w:lvlText w:val="o"/>
+      <w:lvlJc w:val="left"/>
+      <w:pPr>
+        <w:ind w:left="1440" w:hanging="360"/>
+      </w:pPr>
+      <w:rPr>
+        <w:rFonts w:ascii="Courier New" w:hAnsi="Courier New" w:cs="Courier New" w:hint="default"/>
+      </w:rPr>
+    </w:lvl>
+    <w:lvl w:ilvl="2" w:tplc="04090005" w:tentative="1">
+      <w:start w:val="1"/>
+      <w:numFmt w:val="bullet"/>
+      <w:lvlText w:val=""/>
+      <w:lvlJc w:val="left"/>
+      <w:pPr>
+        <w:ind w:left="2160" w:hanging="360"/>
+      </w:pPr>
+      <w:rPr>
+        <w:rFonts w:ascii="Wingdings" w:hAnsi="Wingdings" w:hint="default"/>
+      </w:rPr>
+    </w:lvl>
+    <w:lvl w:ilvl="3" w:tplc="04090001" w:tentative="1">
+      <w:start w:val="1"/>
+      <w:numFmt w:val="bullet"/>
+      <w:lvlText w:val=""/>
+      <w:lvlJc w:val="left"/>
+      <w:pPr>
+        <w:ind w:left="2880" w:hanging="360"/>
+      </w:pPr>
+      <w:rPr>
+        <w:rFonts w:ascii="Symbol" w:hAnsi="Symbol" w:hint="default"/>
+      </w:rPr>
+    </w:lvl>
+    <w:lvl w:ilvl="4" w:tplc="04090003" w:tentative="1">
+      <w:start w:val="1"/>
+      <w:numFmt w:val="bullet"/>
+      <w:lvlText w:val="o"/>
+      <w:lvlJc w:val="left"/>
+      <w:pPr>
+        <w:ind w:left="3600" w:hanging="360"/>
+      </w:pPr>
+      <w:rPr>
+        <w:rFonts w:ascii="Courier New" w:hAnsi="Courier New" w:cs="Courier New" w:hint="default"/>
+      </w:rPr>
+    </w:lvl>
+    <w:lvl w:ilvl="5" w:tplc="04090005" w:tentative="1">
+      <w:start w:val="1"/>
+      <w:numFmt w:val="bullet"/>
+      <w:lvlText w:val=""/>
+      <w:lvlJc w:val="left"/>
+      <w:pPr>
+        <w:ind w:left="4320" w:hanging="360"/>
+      </w:pPr>
+      <w:rPr>
+        <w:rFonts w:ascii="Wingdings" w:hAnsi="Wingdings" w:hint="default"/>
+      </w:rPr>
+    </w:lvl>
+    <w:lvl w:ilvl="6" w:tplc="04090001" w:tentative="1">
+      <w:start w:val="1"/>
+      <w:numFmt w:val="bullet"/>
+      <w:lvlText w:val=""/>
+      <w:lvlJc w:val="left"/>
+      <w:pPr>
+        <w:ind w:left="5040" w:hanging="360"/>
+      </w:pPr>
+      <w:rPr>
+        <w:rFonts w:ascii="Symbol" w:hAnsi="Symbol" w:hint="default"/>
+      </w:rPr>
+    </w:lvl>
+    <w:lvl w:ilvl="7" w:tplc="04090003" w:tentative="1">
+      <w:start w:val="1"/>
+      <w:numFmt w:val="bullet"/>
+      <w:lvlText w:val="o"/>
+      <w:lvlJc w:val="left"/>
+      <w:pPr>
+        <w:ind w:left="5760" w:hanging="360"/>
+      </w:pPr>
+      <w:rPr>
+        <w:rFonts w:ascii="Courier New" w:hAnsi="Courier New" w:cs="Courier New" w:hint="default"/>
+      </w:rPr>
+    </w:lvl>
+    <w:lvl w:ilvl="8" w:tplc="04090005" w:tentative="1">
+      <w:start w:val="1"/>
+      <w:numFmt w:val="bullet"/>
+      <w:lvlText w:val=""/>
+      <w:lvlJc w:val="left"/>
+      <w:pPr>
+        <w:ind w:left="6480" w:hanging="360"/>
+      </w:pPr>
+      <w:rPr>
+        <w:rFonts w:ascii="Wingdings" w:hAnsi="Wingdings" w:hint="default"/>
+      </w:rPr>
+    </w:lvl>
+  </w:abstractNum>
+  <w:abstractNum w:abstractNumId="1" w15:restartNumberingAfterBreak="0">
     <w:nsid w:val="448265AA"/>
     <w:multiLevelType w:val="hybridMultilevel"/>
     <w:tmpl w:val="1242C14A"/>
@@ -3711,7 +5112,7 @@
       <w:lvlJc w:val="left"/>
     </w:lvl>
   </w:abstractNum>
-  <w:abstractNum w:abstractNumId="1" w15:restartNumberingAfterBreak="0">
+  <w:abstractNum w:abstractNumId="2" w15:restartNumberingAfterBreak="0">
     <w:nsid w:val="51556247"/>
     <w:multiLevelType w:val="hybridMultilevel"/>
     <w:tmpl w:val="2B5CC37C"/>
@@ -3797,7 +5198,7 @@
       </w:pPr>
     </w:lvl>
   </w:abstractNum>
-  <w:abstractNum w:abstractNumId="2" w15:restartNumberingAfterBreak="0">
+  <w:abstractNum w:abstractNumId="3" w15:restartNumberingAfterBreak="0">
     <w:nsid w:val="5657210A"/>
     <w:multiLevelType w:val="hybridMultilevel"/>
     <w:tmpl w:val="5DF62302"/>
@@ -3852,22 +5253,25 @@
     </w:lvl>
   </w:abstractNum>
   <w:num w:numId="1" w16cid:durableId="1402826239">
+    <w:abstractNumId w:val="2"/>
+    <w:lvlOverride w:ilvl="0">
+      <w:startOverride w:val="1"/>
+    </w:lvlOverride>
+  </w:num>
+  <w:num w:numId="2" w16cid:durableId="1900750583">
     <w:abstractNumId w:val="1"/>
     <w:lvlOverride w:ilvl="0">
       <w:startOverride w:val="1"/>
     </w:lvlOverride>
   </w:num>
-  <w:num w:numId="2" w16cid:durableId="1900750583">
-    <w:abstractNumId w:val="0"/>
+  <w:num w:numId="3" w16cid:durableId="1247685696">
+    <w:abstractNumId w:val="3"/>
     <w:lvlOverride w:ilvl="0">
       <w:startOverride w:val="1"/>
     </w:lvlOverride>
   </w:num>
-  <w:num w:numId="3" w16cid:durableId="1247685696">
-    <w:abstractNumId w:val="2"/>
-    <w:lvlOverride w:ilvl="0">
-      <w:startOverride w:val="1"/>
-    </w:lvlOverride>
+  <w:num w:numId="4" w16cid:durableId="277494161">
+    <w:abstractNumId w:val="0"/>
   </w:num>
 </w:numbering>
 </file>
@@ -4362,7 +5766,6 @@
   <w:style w:type="character" w:default="1" w:styleId="DefaultParagraphFont">
     <w:name w:val="Default Paragraph Font"/>
     <w:uiPriority w:val="1"/>
-    <w:semiHidden/>
     <w:unhideWhenUsed/>
   </w:style>
   <w:style w:type="table" w:default="1" w:styleId="TableNormal">

</xml_diff>